<commit_message>
Clean: updated portfolio site, resume, professional README
</commit_message>
<xml_diff>
--- a/Colby_Oosthuizen_Resume_2026.docx
+++ b/Colby_Oosthuizen_Resume_2026.docx
@@ -26,12 +26,9 @@
       </w:pPr>
       <w:r>
         <w:rPr>
-          <w:rFonts w:ascii="Calibri" w:cs="Calibri" w:eastAsia="Calibri" w:hAnsi="Calibri"/>
-          <w:color w:val="000000"/>
-          <w:sz w:val="20"/>
-          <w:szCs w:val="20"/>
-        </w:rPr>
-        <w:t xml:space="preserve">colbyoosthuizen@gmail.com | +61 424 530 289 | Brisbane, QLD 4006 | Open to Remote</w:t>
+          <w:sz w:val="20"/>
+        </w:rPr>
+        <w:t>colbyoosthuizen@gmail.com | +61 424 530 289 | Brisbane, QLD 4006 | Open to Remote | Portfolio: portfolio.170-64-183-66.sslip.io | GitHub: github.com/ColbyOosthuizen | LinkedIn: linkedin.com/in/colby-oosthuizen-4b847824a</w:t>
       </w:r>
     </w:p>
     <w:p>

</xml_diff>